<commit_message>
Add 6-session build plan to Chat Mode handoff spec
</commit_message>
<xml_diff>
--- a/docs/specs/HANDOFF_CHAT_MODE.docx
+++ b/docs/specs/HANDOFF_CHAT_MODE.docx
@@ -8164,6 +8164,1926 @@
         <w:t xml:space="preserve">Create git tag on merge to main</w:t>
       </w:r>
     </w:p>
+    <w:p>
+      <w:r>
+        <w:br w:type="page"/>
+      </w:r>
+    </w:p>
+    <w:p>
+      <w:pPr>
+        <w:pStyle w:val="Heading1"/>
+        <w:spacing w:after="200" w:before="360"/>
+      </w:pPr>
+      <w:r>
+        <w:rPr>
+          <w:rFonts w:ascii="Arial" w:cs="Arial" w:eastAsia="Arial" w:hAnsi="Arial"/>
+          <w:b/>
+          <w:bCs/>
+          <w:color w:val="1E40AF"/>
+          <w:sz w:val="32"/>
+          <w:szCs w:val="32"/>
+        </w:rPr>
+        <w:t xml:space="preserve">18. Pod 2 Session Build Plan</w:t>
+      </w:r>
+    </w:p>
+    <w:p>
+      <w:pPr>
+        <w:spacing w:after="120"/>
+      </w:pPr>
+      <w:r>
+        <w:rPr>
+          <w:rFonts w:ascii="Arial" w:cs="Arial" w:eastAsia="Arial" w:hAnsi="Arial"/>
+          <w:color w:val="374151"/>
+          <w:sz w:val="20"/>
+          <w:szCs w:val="20"/>
+        </w:rPr>
+        <w:t xml:space="preserve">This feature is built across 6 Pod 2 sessions. Each session is scoped to be completable in a single Claude conversation. Sessions must be executed in order — each session’s output unblocks the next.</w:t>
+      </w:r>
+    </w:p>
+    <w:p>
+      <w:pPr>
+        <w:spacing w:after="80"/>
+      </w:pPr>
+    </w:p>
+    <w:tbl>
+      <w:tblPr>
+        <w:tblW w:type="dxa" w:w="9840"/>
+        <w:tblBorders>
+          <w:top w:val="single" w:color="auto" w:sz="4"/>
+          <w:left w:val="single" w:color="auto" w:sz="4"/>
+          <w:bottom w:val="single" w:color="auto" w:sz="4"/>
+          <w:right w:val="single" w:color="auto" w:sz="4"/>
+          <w:insideH w:val="single" w:color="auto" w:sz="4"/>
+          <w:insideV w:val="single" w:color="auto" w:sz="4"/>
+        </w:tblBorders>
+      </w:tblPr>
+      <w:tblGrid>
+        <w:gridCol w:w="9840"/>
+      </w:tblGrid>
+      <w:tr>
+        <w:tc>
+          <w:tcPr>
+            <w:tcW w:type="dxa" w:w="9840"/>
+            <w:tcBorders>
+              <w:top w:val="single" w:color="2563EB" w:sz="8"/>
+              <w:left w:val="single" w:color="D1D5DB" w:sz="1"/>
+              <w:bottom w:val="single" w:color="D1D5DB" w:sz="1"/>
+              <w:right w:val="single" w:color="D1D5DB" w:sz="1"/>
+            </w:tcBorders>
+            <w:shd w:fill="DBEAFE" w:val="clear"/>
+            <w:tcMar>
+              <w:top w:type="dxa" w:w="120"/>
+              <w:left w:type="dxa" w:w="200"/>
+              <w:bottom w:type="dxa" w:w="120"/>
+              <w:right w:type="dxa" w:w="200"/>
+            </w:tcMar>
+          </w:tcPr>
+          <w:p>
+            <w:pPr>
+              <w:spacing w:after="40"/>
+            </w:pPr>
+            <w:r>
+              <w:rPr>
+                <w:rFonts w:ascii="Arial" w:cs="Arial" w:eastAsia="Arial" w:hAnsi="Arial"/>
+                <w:b/>
+                <w:bCs/>
+                <w:color w:val="1E40AF"/>
+                <w:sz w:val="24"/>
+                <w:szCs w:val="24"/>
+              </w:rPr>
+              <w:t xml:space="preserve">SESSION 1: Schema + Edge Function Foundation</w:t>
+            </w:r>
+          </w:p>
+          <w:p>
+            <w:r>
+              <w:rPr>
+                <w:rFonts w:ascii="Arial" w:cs="Arial" w:eastAsia="Arial" w:hAnsi="Arial"/>
+                <w:color w:val="6B7280"/>
+                <w:sz w:val="18"/>
+                <w:szCs w:val="18"/>
+              </w:rPr>
+              <w:t xml:space="preserve">Blocking: All subsequent sessions</w:t>
+            </w:r>
+          </w:p>
+        </w:tc>
+      </w:tr>
+    </w:tbl>
+    <w:p>
+      <w:pPr>
+        <w:spacing w:after="80"/>
+      </w:pPr>
+    </w:p>
+    <w:p>
+      <w:pPr>
+        <w:pStyle w:val="ListParagraph"/>
+        <w:numPr>
+          <w:ilvl w:val="0"/>
+          <w:numId w:val="2"/>
+        </w:numPr>
+        <w:spacing w:after="60"/>
+      </w:pPr>
+      <w:r>
+        <w:rPr>
+          <w:rFonts w:ascii="Arial" w:cs="Arial" w:eastAsia="Arial" w:hAnsi="Arial"/>
+          <w:sz w:val="20"/>
+          <w:szCs w:val="20"/>
+        </w:rPr>
+        <w:t xml:space="preserve">Run SQL migration: Create saved_prompts table with indexes and RLS policy (Section 4.1)</w:t>
+      </w:r>
+    </w:p>
+    <w:p>
+      <w:pPr>
+        <w:pStyle w:val="ListParagraph"/>
+        <w:numPr>
+          <w:ilvl w:val="0"/>
+          <w:numId w:val="2"/>
+        </w:numPr>
+        <w:spacing w:after="60"/>
+      </w:pPr>
+      <w:r>
+        <w:rPr>
+          <w:rFonts w:ascii="Arial" w:cs="Arial" w:eastAsia="Arial" w:hAnsi="Arial"/>
+          <w:sz w:val="20"/>
+          <w:szCs w:val="20"/>
+        </w:rPr>
+        <w:t xml:space="preserve">Run SQL migration: Create chat_usage table with indexes and RLS policy (Section 4.2)</w:t>
+      </w:r>
+    </w:p>
+    <w:p>
+      <w:pPr>
+        <w:pStyle w:val="ListParagraph"/>
+        <w:numPr>
+          <w:ilvl w:val="0"/>
+          <w:numId w:val="2"/>
+        </w:numPr>
+        <w:spacing w:after="60"/>
+      </w:pPr>
+      <w:r>
+        <w:rPr>
+          <w:rFonts w:ascii="Arial" w:cs="Arial" w:eastAsia="Arial" w:hAnsi="Arial"/>
+          <w:sz w:val="20"/>
+          <w:szCs w:val="20"/>
+        </w:rPr>
+        <w:t xml:space="preserve">Run SQL migration: Create chat_analytics table (Section 11)</w:t>
+      </w:r>
+    </w:p>
+    <w:p>
+      <w:pPr>
+        <w:pStyle w:val="ListParagraph"/>
+        <w:numPr>
+          <w:ilvl w:val="0"/>
+          <w:numId w:val="2"/>
+        </w:numPr>
+        <w:spacing w:after="60"/>
+      </w:pPr>
+      <w:r>
+        <w:rPr>
+          <w:rFonts w:ascii="Arial" w:cs="Arial" w:eastAsia="Arial" w:hAnsi="Arial"/>
+          <w:sz w:val="20"/>
+          <w:szCs w:val="20"/>
+        </w:rPr>
+        <w:t xml:space="preserve">Build and deploy Edge Function: chat-job-search (Section 11) — Claude Haiku integration, system prompt, rate limit check, filter extraction, response validation</w:t>
+      </w:r>
+    </w:p>
+    <w:p>
+      <w:pPr>
+        <w:pStyle w:val="ListParagraph"/>
+        <w:numPr>
+          <w:ilvl w:val="0"/>
+          <w:numId w:val="2"/>
+        </w:numPr>
+        <w:spacing w:after="60"/>
+      </w:pPr>
+      <w:r>
+        <w:rPr>
+          <w:rFonts w:ascii="Arial" w:cs="Arial" w:eastAsia="Arial" w:hAnsi="Arial"/>
+          <w:sz w:val="20"/>
+          <w:szCs w:val="20"/>
+        </w:rPr>
+        <w:t xml:space="preserve">Test Edge Function: verify auth gate, rate limit enforcement, Claude response parsing, &lt;filters&gt; block extraction and validation, graceful error handling</w:t>
+      </w:r>
+    </w:p>
+    <w:p>
+      <w:pPr>
+        <w:pStyle w:val="ListParagraph"/>
+        <w:numPr>
+          <w:ilvl w:val="0"/>
+          <w:numId w:val="2"/>
+        </w:numPr>
+        <w:spacing w:after="60"/>
+      </w:pPr>
+      <w:r>
+        <w:rPr>
+          <w:rFonts w:ascii="Arial" w:cs="Arial" w:eastAsia="Arial" w:hAnsi="Arial"/>
+          <w:sz w:val="20"/>
+          <w:szCs w:val="20"/>
+        </w:rPr>
+        <w:t xml:space="preserve">Build and deploy Edge Function: filter-to-prompt (Section 7.1) — converts saved filter JSON to natural language via Haiku</w:t>
+      </w:r>
+    </w:p>
+    <w:p>
+      <w:pPr>
+        <w:pStyle w:val="ListParagraph"/>
+        <w:numPr>
+          <w:ilvl w:val="0"/>
+          <w:numId w:val="2"/>
+        </w:numPr>
+        <w:spacing w:after="120"/>
+      </w:pPr>
+      <w:r>
+        <w:rPr>
+          <w:rFonts w:ascii="Arial" w:cs="Arial" w:eastAsia="Arial" w:hAnsi="Arial"/>
+          <w:sz w:val="20"/>
+          <w:szCs w:val="20"/>
+        </w:rPr>
+        <w:t xml:space="preserve">Build and deploy Edge Function: prompt-to-filter (Section 7.2) — extracts structured filter JSON from conversation history via Haiku</w:t>
+      </w:r>
+    </w:p>
+    <w:p>
+      <w:pPr>
+        <w:spacing w:after="80"/>
+      </w:pPr>
+      <w:r>
+        <w:rPr>
+          <w:rFonts w:ascii="Arial" w:cs="Arial" w:eastAsia="Arial" w:hAnsi="Arial"/>
+          <w:b/>
+          <w:bCs/>
+          <w:color w:val="1F2937"/>
+          <w:sz w:val="20"/>
+          <w:szCs w:val="20"/>
+        </w:rPr>
+        <w:t xml:space="preserve">Session 1 exit criteria: </w:t>
+      </w:r>
+      <w:r>
+        <w:rPr>
+          <w:rFonts w:ascii="Arial" w:cs="Arial" w:eastAsia="Arial" w:hAnsi="Arial"/>
+          <w:color w:val="374151"/>
+          <w:sz w:val="20"/>
+          <w:szCs w:val="20"/>
+        </w:rPr>
+        <w:t xml:space="preserve">All 3 tables exist with RLS. chat-job-search returns valid responses with &lt;filters&gt; blocks. filter-to-prompt and prompt-to-filter produce correct round-trip conversions. Rate limiting rejects requests past threshold.</w:t>
+      </w:r>
+    </w:p>
+    <w:p>
+      <w:pPr>
+        <w:spacing w:after="80"/>
+      </w:pPr>
+    </w:p>
+    <w:tbl>
+      <w:tblPr>
+        <w:tblW w:type="dxa" w:w="9840"/>
+        <w:tblBorders>
+          <w:top w:val="single" w:color="auto" w:sz="4"/>
+          <w:left w:val="single" w:color="auto" w:sz="4"/>
+          <w:bottom w:val="single" w:color="auto" w:sz="4"/>
+          <w:right w:val="single" w:color="auto" w:sz="4"/>
+          <w:insideH w:val="single" w:color="auto" w:sz="4"/>
+          <w:insideV w:val="single" w:color="auto" w:sz="4"/>
+        </w:tblBorders>
+      </w:tblPr>
+      <w:tblGrid>
+        <w:gridCol w:w="9840"/>
+      </w:tblGrid>
+      <w:tr>
+        <w:tc>
+          <w:tcPr>
+            <w:tcW w:type="dxa" w:w="9840"/>
+            <w:tcBorders>
+              <w:top w:val="single" w:color="2563EB" w:sz="8"/>
+              <w:left w:val="single" w:color="D1D5DB" w:sz="1"/>
+              <w:bottom w:val="single" w:color="D1D5DB" w:sz="1"/>
+              <w:right w:val="single" w:color="D1D5DB" w:sz="1"/>
+            </w:tcBorders>
+            <w:shd w:fill="DBEAFE" w:val="clear"/>
+            <w:tcMar>
+              <w:top w:type="dxa" w:w="120"/>
+              <w:left w:type="dxa" w:w="200"/>
+              <w:bottom w:type="dxa" w:w="120"/>
+              <w:right w:type="dxa" w:w="200"/>
+            </w:tcMar>
+          </w:tcPr>
+          <w:p>
+            <w:pPr>
+              <w:spacing w:after="40"/>
+            </w:pPr>
+            <w:r>
+              <w:rPr>
+                <w:rFonts w:ascii="Arial" w:cs="Arial" w:eastAsia="Arial" w:hAnsi="Arial"/>
+                <w:b/>
+                <w:bCs/>
+                <w:color w:val="1E40AF"/>
+                <w:sz w:val="24"/>
+                <w:szCs w:val="24"/>
+              </w:rPr>
+              <w:t xml:space="preserve">SESSION 2: Mode Toggle + Chat Panel UI</w:t>
+            </w:r>
+          </w:p>
+          <w:p>
+            <w:r>
+              <w:rPr>
+                <w:rFonts w:ascii="Arial" w:cs="Arial" w:eastAsia="Arial" w:hAnsi="Arial"/>
+                <w:color w:val="6B7280"/>
+                <w:sz w:val="18"/>
+                <w:szCs w:val="18"/>
+              </w:rPr>
+              <w:t xml:space="preserve">Depends on: Session 1 (Edge Functions deployed)</w:t>
+            </w:r>
+          </w:p>
+        </w:tc>
+      </w:tr>
+    </w:tbl>
+    <w:p>
+      <w:pPr>
+        <w:spacing w:after="80"/>
+      </w:pPr>
+    </w:p>
+    <w:p>
+      <w:pPr>
+        <w:pStyle w:val="ListParagraph"/>
+        <w:numPr>
+          <w:ilvl w:val="0"/>
+          <w:numId w:val="2"/>
+        </w:numPr>
+        <w:spacing w:after="60"/>
+      </w:pPr>
+      <w:r>
+        <w:rPr>
+          <w:rFonts w:ascii="Arial" w:cs="Arial" w:eastAsia="Arial" w:hAnsi="Arial"/>
+          <w:sz w:val="20"/>
+          <w:szCs w:val="20"/>
+        </w:rPr>
+        <w:t xml:space="preserve">Build mode toggle segmented control at top of Jobs Feed (Section 5) — Filters / Chat with 200ms crossfade transition</w:t>
+      </w:r>
+    </w:p>
+    <w:p>
+      <w:pPr>
+        <w:pStyle w:val="ListParagraph"/>
+        <w:numPr>
+          <w:ilvl w:val="0"/>
+          <w:numId w:val="2"/>
+        </w:numPr>
+        <w:spacing w:after="60"/>
+      </w:pPr>
+      <w:r>
+        <w:rPr>
+          <w:rFonts w:ascii="Arial" w:cs="Arial" w:eastAsia="Arial" w:hAnsi="Arial"/>
+          <w:sz w:val="20"/>
+          <w:szCs w:val="20"/>
+        </w:rPr>
+        <w:t xml:space="preserve">Build chat panel component (Section 6.1) — header row, scrollable conversation area, input textarea, Send and Save buttons</w:t>
+      </w:r>
+    </w:p>
+    <w:p>
+      <w:pPr>
+        <w:pStyle w:val="ListParagraph"/>
+        <w:numPr>
+          <w:ilvl w:val="0"/>
+          <w:numId w:val="2"/>
+        </w:numPr>
+        <w:spacing w:after="60"/>
+      </w:pPr>
+      <w:r>
+        <w:rPr>
+          <w:rFonts w:ascii="Arial" w:cs="Arial" w:eastAsia="Arial" w:hAnsi="Arial"/>
+          <w:sz w:val="20"/>
+          <w:szCs w:val="20"/>
+        </w:rPr>
+        <w:t xml:space="preserve">Wire chat panel to chat-job-search Edge Function — send message, receive response, render in conversation area, extract &lt;filters&gt; block and update feed</w:t>
+      </w:r>
+    </w:p>
+    <w:p>
+      <w:pPr>
+        <w:pStyle w:val="ListParagraph"/>
+        <w:numPr>
+          <w:ilvl w:val="0"/>
+          <w:numId w:val="2"/>
+        </w:numPr>
+        <w:spacing w:after="60"/>
+      </w:pPr>
+      <w:r>
+        <w:rPr>
+          <w:rFonts w:ascii="Arial" w:cs="Arial" w:eastAsia="Arial" w:hAnsi="Arial"/>
+          <w:sz w:val="20"/>
+          <w:szCs w:val="20"/>
+        </w:rPr>
+        <w:t xml:space="preserve">Implement client-side ChatSession class (Section 7.2) — message history, 20-message cap, off-topic pattern matching (Layer 1 injection protection)</w:t>
+      </w:r>
+    </w:p>
+    <w:p>
+      <w:pPr>
+        <w:pStyle w:val="ListParagraph"/>
+        <w:numPr>
+          <w:ilvl w:val="0"/>
+          <w:numId w:val="2"/>
+        </w:numPr>
+        <w:spacing w:after="60"/>
+      </w:pPr>
+      <w:r>
+        <w:rPr>
+          <w:rFonts w:ascii="Arial" w:cs="Arial" w:eastAsia="Arial" w:hAnsi="Arial"/>
+          <w:sz w:val="20"/>
+          <w:szCs w:val="20"/>
+        </w:rPr>
+        <w:t xml:space="preserve">Build rate limit UI (Section 9.2) — amber banner with remaining count, reset timer, Switch to Filters and Upgrade CTAs</w:t>
+      </w:r>
+    </w:p>
+    <w:p>
+      <w:pPr>
+        <w:pStyle w:val="ListParagraph"/>
+        <w:numPr>
+          <w:ilvl w:val="0"/>
+          <w:numId w:val="2"/>
+        </w:numPr>
+        <w:spacing w:after="120"/>
+      </w:pPr>
+      <w:r>
+        <w:rPr>
+          <w:rFonts w:ascii="Arial" w:cs="Arial" w:eastAsia="Arial" w:hAnsi="Arial"/>
+          <w:sz w:val="20"/>
+          <w:szCs w:val="20"/>
+        </w:rPr>
+        <w:t xml:space="preserve">Add all CSS from Sections 5.2, 6.3 to stylesheet</w:t>
+      </w:r>
+    </w:p>
+    <w:p>
+      <w:pPr>
+        <w:spacing w:after="80"/>
+      </w:pPr>
+      <w:r>
+        <w:rPr>
+          <w:rFonts w:ascii="Arial" w:cs="Arial" w:eastAsia="Arial" w:hAnsi="Arial"/>
+          <w:b/>
+          <w:bCs/>
+          <w:color w:val="1F2937"/>
+          <w:sz w:val="20"/>
+          <w:szCs w:val="20"/>
+        </w:rPr>
+        <w:t xml:space="preserve">Session 2 exit criteria: </w:t>
+      </w:r>
+      <w:r>
+        <w:rPr>
+          <w:rFonts w:ascii="Arial" w:cs="Arial" w:eastAsia="Arial" w:hAnsi="Arial"/>
+          <w:color w:val="374151"/>
+          <w:sz w:val="20"/>
+          <w:szCs w:val="20"/>
+        </w:rPr>
+        <w:t xml:space="preserve">User can toggle between Filters and Chat. Chat messages send to Haiku and render responses. Job feed updates in real-time from extracted filters. Rate limit UI shows when limit is hit. Off-topic messages blocked client-side.</w:t>
+      </w:r>
+    </w:p>
+    <w:p>
+      <w:pPr>
+        <w:spacing w:after="80"/>
+      </w:pPr>
+    </w:p>
+    <w:tbl>
+      <w:tblPr>
+        <w:tblW w:type="dxa" w:w="9840"/>
+        <w:tblBorders>
+          <w:top w:val="single" w:color="auto" w:sz="4"/>
+          <w:left w:val="single" w:color="auto" w:sz="4"/>
+          <w:bottom w:val="single" w:color="auto" w:sz="4"/>
+          <w:right w:val="single" w:color="auto" w:sz="4"/>
+          <w:insideH w:val="single" w:color="auto" w:sz="4"/>
+          <w:insideV w:val="single" w:color="auto" w:sz="4"/>
+        </w:tblBorders>
+      </w:tblPr>
+      <w:tblGrid>
+        <w:gridCol w:w="9840"/>
+      </w:tblGrid>
+      <w:tr>
+        <w:tc>
+          <w:tcPr>
+            <w:tcW w:type="dxa" w:w="9840"/>
+            <w:tcBorders>
+              <w:top w:val="single" w:color="2563EB" w:sz="8"/>
+              <w:left w:val="single" w:color="D1D5DB" w:sz="1"/>
+              <w:bottom w:val="single" w:color="D1D5DB" w:sz="1"/>
+              <w:right w:val="single" w:color="D1D5DB" w:sz="1"/>
+            </w:tcBorders>
+            <w:shd w:fill="DBEAFE" w:val="clear"/>
+            <w:tcMar>
+              <w:top w:type="dxa" w:w="120"/>
+              <w:left w:type="dxa" w:w="200"/>
+              <w:bottom w:type="dxa" w:w="120"/>
+              <w:right w:type="dxa" w:w="200"/>
+            </w:tcMar>
+          </w:tcPr>
+          <w:p>
+            <w:pPr>
+              <w:spacing w:after="40"/>
+            </w:pPr>
+            <w:r>
+              <w:rPr>
+                <w:rFonts w:ascii="Arial" w:cs="Arial" w:eastAsia="Arial" w:hAnsi="Arial"/>
+                <w:b/>
+                <w:bCs/>
+                <w:color w:val="1E40AF"/>
+                <w:sz w:val="24"/>
+                <w:szCs w:val="24"/>
+              </w:rPr>
+              <w:t xml:space="preserve">SESSION 3: Bidirectional Sync</w:t>
+            </w:r>
+          </w:p>
+          <w:p>
+            <w:r>
+              <w:rPr>
+                <w:rFonts w:ascii="Arial" w:cs="Arial" w:eastAsia="Arial" w:hAnsi="Arial"/>
+                <w:color w:val="6B7280"/>
+                <w:sz w:val="18"/>
+                <w:szCs w:val="18"/>
+              </w:rPr>
+              <w:t xml:space="preserve">Depends on: Session 2 (toggle + chat panel working)</w:t>
+            </w:r>
+          </w:p>
+        </w:tc>
+      </w:tr>
+    </w:tbl>
+    <w:p>
+      <w:pPr>
+        <w:spacing w:after="80"/>
+      </w:pPr>
+    </w:p>
+    <w:p>
+      <w:pPr>
+        <w:pStyle w:val="ListParagraph"/>
+        <w:numPr>
+          <w:ilvl w:val="0"/>
+          <w:numId w:val="2"/>
+        </w:numPr>
+        <w:spacing w:after="60"/>
+      </w:pPr>
+      <w:r>
+        <w:rPr>
+          <w:rFonts w:ascii="Arial" w:cs="Arial" w:eastAsia="Arial" w:hAnsi="Arial"/>
+          <w:sz w:val="20"/>
+          <w:szCs w:val="20"/>
+        </w:rPr>
+        <w:t xml:space="preserve">Wire Filter→Chat sync: on toggle to Chat with active filter, call filter-to-prompt Edge Function and pre-fill chat input with generated prompt (Section 6.2) — do NOT auto-send</w:t>
+      </w:r>
+    </w:p>
+    <w:p>
+      <w:pPr>
+        <w:pStyle w:val="ListParagraph"/>
+        <w:numPr>
+          <w:ilvl w:val="0"/>
+          <w:numId w:val="2"/>
+        </w:numPr>
+        <w:spacing w:after="60"/>
+      </w:pPr>
+      <w:r>
+        <w:rPr>
+          <w:rFonts w:ascii="Arial" w:cs="Arial" w:eastAsia="Arial" w:hAnsi="Arial"/>
+          <w:sz w:val="20"/>
+          <w:szCs w:val="20"/>
+        </w:rPr>
+        <w:t xml:space="preserve">Add data-auto-generated attribute to track whether the prompt was auto-generated, modified, or scrapped (for PostHog analytics)</w:t>
+      </w:r>
+    </w:p>
+    <w:p>
+      <w:pPr>
+        <w:pStyle w:val="ListParagraph"/>
+        <w:numPr>
+          <w:ilvl w:val="0"/>
+          <w:numId w:val="2"/>
+        </w:numPr>
+        <w:spacing w:after="60"/>
+      </w:pPr>
+      <w:r>
+        <w:rPr>
+          <w:rFonts w:ascii="Arial" w:cs="Arial" w:eastAsia="Arial" w:hAnsi="Arial"/>
+          <w:sz w:val="20"/>
+          <w:szCs w:val="20"/>
+        </w:rPr>
+        <w:t xml:space="preserve">Wire Chat→Filter sync: on toggle to Filters with conversation history, call prompt-to-filter Edge Function, populate filter pills from returned JSON, show confirmation banner</w:t>
+      </w:r>
+    </w:p>
+    <w:p>
+      <w:pPr>
+        <w:pStyle w:val="ListParagraph"/>
+        <w:numPr>
+          <w:ilvl w:val="0"/>
+          <w:numId w:val="2"/>
+        </w:numPr>
+        <w:spacing w:after="60"/>
+      </w:pPr>
+      <w:r>
+        <w:rPr>
+          <w:rFonts w:ascii="Arial" w:cs="Arial" w:eastAsia="Arial" w:hAnsi="Arial"/>
+          <w:sz w:val="20"/>
+          <w:szCs w:val="20"/>
+        </w:rPr>
+        <w:t xml:space="preserve">Handle edge cases: empty filter (no prompt generated), empty conversation (no filters extracted), partial extraction (some fields null), additional_context field display</w:t>
+      </w:r>
+    </w:p>
+    <w:p>
+      <w:pPr>
+        <w:pStyle w:val="ListParagraph"/>
+        <w:numPr>
+          <w:ilvl w:val="0"/>
+          <w:numId w:val="2"/>
+        </w:numPr>
+        <w:spacing w:after="120"/>
+      </w:pPr>
+      <w:r>
+        <w:rPr>
+          <w:rFonts w:ascii="Arial" w:cs="Arial" w:eastAsia="Arial" w:hAnsi="Arial"/>
+          <w:sz w:val="20"/>
+          <w:szCs w:val="20"/>
+        </w:rPr>
+        <w:t xml:space="preserve">Test round-trip fidelity: create filter → toggle to chat → modify prompt → toggle back to filters → verify pills match. Repeat with various filter configurations.</w:t>
+      </w:r>
+    </w:p>
+    <w:p>
+      <w:pPr>
+        <w:spacing w:after="80"/>
+      </w:pPr>
+      <w:r>
+        <w:rPr>
+          <w:rFonts w:ascii="Arial" w:cs="Arial" w:eastAsia="Arial" w:hAnsi="Arial"/>
+          <w:b/>
+          <w:bCs/>
+          <w:color w:val="1F2937"/>
+          <w:sz w:val="20"/>
+          <w:szCs w:val="20"/>
+        </w:rPr>
+        <w:t xml:space="preserve">Session 3 exit criteria: </w:t>
+      </w:r>
+      <w:r>
+        <w:rPr>
+          <w:rFonts w:ascii="Arial" w:cs="Arial" w:eastAsia="Arial" w:hAnsi="Arial"/>
+          <w:color w:val="374151"/>
+          <w:sz w:val="20"/>
+          <w:szCs w:val="20"/>
+        </w:rPr>
+        <w:t xml:space="preserve">Switching Filter→Chat pre-fills a natural language prompt. Switching Chat→Filter populates pills. Confirmation banner shows on reverse sync. Round-trip preserves intent for standard filter configurations.</w:t>
+      </w:r>
+    </w:p>
+    <w:p>
+      <w:pPr>
+        <w:spacing w:after="80"/>
+      </w:pPr>
+    </w:p>
+    <w:tbl>
+      <w:tblPr>
+        <w:tblW w:type="dxa" w:w="9840"/>
+        <w:tblBorders>
+          <w:top w:val="single" w:color="auto" w:sz="4"/>
+          <w:left w:val="single" w:color="auto" w:sz="4"/>
+          <w:bottom w:val="single" w:color="auto" w:sz="4"/>
+          <w:right w:val="single" w:color="auto" w:sz="4"/>
+          <w:insideH w:val="single" w:color="auto" w:sz="4"/>
+          <w:insideV w:val="single" w:color="auto" w:sz="4"/>
+        </w:tblBorders>
+      </w:tblPr>
+      <w:tblGrid>
+        <w:gridCol w:w="9840"/>
+      </w:tblGrid>
+      <w:tr>
+        <w:tc>
+          <w:tcPr>
+            <w:tcW w:type="dxa" w:w="9840"/>
+            <w:tcBorders>
+              <w:top w:val="single" w:color="2563EB" w:sz="8"/>
+              <w:left w:val="single" w:color="D1D5DB" w:sz="1"/>
+              <w:bottom w:val="single" w:color="D1D5DB" w:sz="1"/>
+              <w:right w:val="single" w:color="D1D5DB" w:sz="1"/>
+            </w:tcBorders>
+            <w:shd w:fill="DBEAFE" w:val="clear"/>
+            <w:tcMar>
+              <w:top w:type="dxa" w:w="120"/>
+              <w:left w:type="dxa" w:w="200"/>
+              <w:bottom w:type="dxa" w:w="120"/>
+              <w:right w:type="dxa" w:w="200"/>
+            </w:tcMar>
+          </w:tcPr>
+          <w:p>
+            <w:pPr>
+              <w:spacing w:after="40"/>
+            </w:pPr>
+            <w:r>
+              <w:rPr>
+                <w:rFonts w:ascii="Arial" w:cs="Arial" w:eastAsia="Arial" w:hAnsi="Arial"/>
+                <w:b/>
+                <w:bCs/>
+                <w:color w:val="1E40AF"/>
+                <w:sz w:val="24"/>
+                <w:szCs w:val="24"/>
+              </w:rPr>
+              <w:t xml:space="preserve">SESSION 4: Saved Prompts + Persistence</w:t>
+            </w:r>
+          </w:p>
+          <w:p>
+            <w:r>
+              <w:rPr>
+                <w:rFonts w:ascii="Arial" w:cs="Arial" w:eastAsia="Arial" w:hAnsi="Arial"/>
+                <w:color w:val="6B7280"/>
+                <w:sz w:val="18"/>
+                <w:szCs w:val="18"/>
+              </w:rPr>
+              <w:t xml:space="preserve">Depends on: Session 3 (sync working, derived_filters extractable)</w:t>
+            </w:r>
+          </w:p>
+        </w:tc>
+      </w:tr>
+    </w:tbl>
+    <w:p>
+      <w:pPr>
+        <w:spacing w:after="80"/>
+      </w:pPr>
+    </w:p>
+    <w:p>
+      <w:pPr>
+        <w:pStyle w:val="ListParagraph"/>
+        <w:numPr>
+          <w:ilvl w:val="0"/>
+          <w:numId w:val="2"/>
+        </w:numPr>
+        <w:spacing w:after="60"/>
+      </w:pPr>
+      <w:r>
+        <w:rPr>
+          <w:rFonts w:ascii="Arial" w:cs="Arial" w:eastAsia="Arial" w:hAnsi="Arial"/>
+          <w:sz w:val="20"/>
+          <w:szCs w:val="20"/>
+        </w:rPr>
+        <w:t xml:space="preserve">Build Save Prompt dialog (Section 9.3) — name input, color selector (same 10-color palette as filters), derived filters preview, Save/Cancel buttons</w:t>
+      </w:r>
+    </w:p>
+    <w:p>
+      <w:pPr>
+        <w:pStyle w:val="ListParagraph"/>
+        <w:numPr>
+          <w:ilvl w:val="0"/>
+          <w:numId w:val="2"/>
+        </w:numPr>
+        <w:spacing w:after="60"/>
+      </w:pPr>
+      <w:r>
+        <w:rPr>
+          <w:rFonts w:ascii="Arial" w:cs="Arial" w:eastAsia="Arial" w:hAnsi="Arial"/>
+          <w:sz w:val="20"/>
+          <w:szCs w:val="20"/>
+        </w:rPr>
+        <w:t xml:space="preserve">Wire Save button to upsert saved_prompts table — store conversation JSONB + derived_filters JSONB + name + color_index</w:t>
+      </w:r>
+    </w:p>
+    <w:p>
+      <w:pPr>
+        <w:pStyle w:val="ListParagraph"/>
+        <w:numPr>
+          <w:ilvl w:val="0"/>
+          <w:numId w:val="2"/>
+        </w:numPr>
+        <w:spacing w:after="60"/>
+      </w:pPr>
+      <w:r>
+        <w:rPr>
+          <w:rFonts w:ascii="Arial" w:cs="Arial" w:eastAsia="Arial" w:hAnsi="Arial"/>
+          <w:sz w:val="20"/>
+          <w:szCs w:val="20"/>
+        </w:rPr>
+        <w:t xml:space="preserve">Build Load Prompt dropdown in chat panel header (Section 9.4) — list user’s saved prompts, load conversation into chat panel on select, set as active</w:t>
+      </w:r>
+    </w:p>
+    <w:p>
+      <w:pPr>
+        <w:pStyle w:val="ListParagraph"/>
+        <w:numPr>
+          <w:ilvl w:val="0"/>
+          <w:numId w:val="2"/>
+        </w:numPr>
+        <w:spacing w:after="60"/>
+      </w:pPr>
+      <w:r>
+        <w:rPr>
+          <w:rFonts w:ascii="Arial" w:cs="Arial" w:eastAsia="Arial" w:hAnsi="Arial"/>
+          <w:sz w:val="20"/>
+          <w:szCs w:val="20"/>
+        </w:rPr>
+        <w:t xml:space="preserve">Implement derived_filters re-extraction — every time conversation is updated (new message), re-extract derived_filters via prompt-to-filter and update the saved_prompt record</w:t>
+      </w:r>
+    </w:p>
+    <w:p>
+      <w:pPr>
+        <w:pStyle w:val="ListParagraph"/>
+        <w:numPr>
+          <w:ilvl w:val="0"/>
+          <w:numId w:val="2"/>
+        </w:numPr>
+        <w:spacing w:after="60"/>
+      </w:pPr>
+      <w:r>
+        <w:rPr>
+          <w:rFonts w:ascii="Arial" w:cs="Arial" w:eastAsia="Arial" w:hAnsi="Arial"/>
+          <w:sz w:val="20"/>
+          <w:szCs w:val="20"/>
+        </w:rPr>
+        <w:t xml:space="preserve">Add saved prompts to the saved filter selector on the Jobs Feed — prompts appear alongside filters, distinguished by a chat icon. Selecting a prompt activates its derived_filters for the feed query.</w:t>
+      </w:r>
+    </w:p>
+    <w:p>
+      <w:pPr>
+        <w:pStyle w:val="ListParagraph"/>
+        <w:numPr>
+          <w:ilvl w:val="0"/>
+          <w:numId w:val="2"/>
+        </w:numPr>
+        <w:spacing w:after="120"/>
+      </w:pPr>
+      <w:r>
+        <w:rPr>
+          <w:rFonts w:ascii="Arial" w:cs="Arial" w:eastAsia="Arial" w:hAnsi="Arial"/>
+          <w:sz w:val="20"/>
+          <w:szCs w:val="20"/>
+        </w:rPr>
+        <w:t xml:space="preserve">Test: save prompt → reload page → load prompt → verify conversation restores → verify feed shows correct results from derived_filters</w:t>
+      </w:r>
+    </w:p>
+    <w:p>
+      <w:pPr>
+        <w:spacing w:after="80"/>
+      </w:pPr>
+      <w:r>
+        <w:rPr>
+          <w:rFonts w:ascii="Arial" w:cs="Arial" w:eastAsia="Arial" w:hAnsi="Arial"/>
+          <w:b/>
+          <w:bCs/>
+          <w:color w:val="1F2937"/>
+          <w:sz w:val="20"/>
+          <w:szCs w:val="20"/>
+        </w:rPr>
+        <w:t xml:space="preserve">Session 4 exit criteria: </w:t>
+      </w:r>
+      <w:r>
+        <w:rPr>
+          <w:rFonts w:ascii="Arial" w:cs="Arial" w:eastAsia="Arial" w:hAnsi="Arial"/>
+          <w:color w:val="374151"/>
+          <w:sz w:val="20"/>
+          <w:szCs w:val="20"/>
+        </w:rPr>
+        <w:t xml:space="preserve">Users can save, name, and reload chat prompts. Saved prompts persist across sessions via Supabase. Prompts appear in the filter selector. Derived filters update on every conversation change.</w:t>
+      </w:r>
+    </w:p>
+    <w:p>
+      <w:pPr>
+        <w:spacing w:after="80"/>
+      </w:pPr>
+    </w:p>
+    <w:tbl>
+      <w:tblPr>
+        <w:tblW w:type="dxa" w:w="9840"/>
+        <w:tblBorders>
+          <w:top w:val="single" w:color="auto" w:sz="4"/>
+          <w:left w:val="single" w:color="auto" w:sz="4"/>
+          <w:bottom w:val="single" w:color="auto" w:sz="4"/>
+          <w:right w:val="single" w:color="auto" w:sz="4"/>
+          <w:insideH w:val="single" w:color="auto" w:sz="4"/>
+          <w:insideV w:val="single" w:color="auto" w:sz="4"/>
+        </w:tblBorders>
+      </w:tblPr>
+      <w:tblGrid>
+        <w:gridCol w:w="9840"/>
+      </w:tblGrid>
+      <w:tr>
+        <w:tc>
+          <w:tcPr>
+            <w:tcW w:type="dxa" w:w="9840"/>
+            <w:tcBorders>
+              <w:top w:val="single" w:color="2563EB" w:sz="8"/>
+              <w:left w:val="single" w:color="D1D5DB" w:sz="1"/>
+              <w:bottom w:val="single" w:color="D1D5DB" w:sz="1"/>
+              <w:right w:val="single" w:color="D1D5DB" w:sz="1"/>
+            </w:tcBorders>
+            <w:shd w:fill="DBEAFE" w:val="clear"/>
+            <w:tcMar>
+              <w:top w:type="dxa" w:w="120"/>
+              <w:left w:type="dxa" w:w="200"/>
+              <w:bottom w:type="dxa" w:w="120"/>
+              <w:right w:type="dxa" w:w="200"/>
+            </w:tcMar>
+          </w:tcPr>
+          <w:p>
+            <w:pPr>
+              <w:spacing w:after="40"/>
+            </w:pPr>
+            <w:r>
+              <w:rPr>
+                <w:rFonts w:ascii="Arial" w:cs="Arial" w:eastAsia="Arial" w:hAnsi="Arial"/>
+                <w:b/>
+                <w:bCs/>
+                <w:color w:val="1E40AF"/>
+                <w:sz w:val="24"/>
+                <w:szCs w:val="24"/>
+              </w:rPr>
+              <w:t xml:space="preserve">SESSION 5: System Integration (Matching, Notifications, Auto-Apply)</w:t>
+            </w:r>
+          </w:p>
+          <w:p>
+            <w:r>
+              <w:rPr>
+                <w:rFonts w:ascii="Arial" w:cs="Arial" w:eastAsia="Arial" w:hAnsi="Arial"/>
+                <w:color w:val="6B7280"/>
+                <w:sz w:val="18"/>
+                <w:szCs w:val="18"/>
+              </w:rPr>
+              <w:t xml:space="preserve">Depends on: Session 4 (saved prompts with derived_filters persisted)</w:t>
+            </w:r>
+          </w:p>
+        </w:tc>
+      </w:tr>
+    </w:tbl>
+    <w:p>
+      <w:pPr>
+        <w:spacing w:after="80"/>
+      </w:pPr>
+    </w:p>
+    <w:p>
+      <w:pPr>
+        <w:pStyle w:val="ListParagraph"/>
+        <w:numPr>
+          <w:ilvl w:val="0"/>
+          <w:numId w:val="2"/>
+        </w:numPr>
+        <w:spacing w:after="60"/>
+      </w:pPr>
+      <w:r>
+        <w:rPr>
+          <w:rFonts w:ascii="Arial" w:cs="Arial" w:eastAsia="Arial" w:hAnsi="Arial"/>
+          <w:sz w:val="20"/>
+          <w:szCs w:val="20"/>
+        </w:rPr>
+        <w:t xml:space="preserve">Modify refreshJobFeed() / query builder to accept either a saved filter OR a saved prompt’s derived_filters as input — both produce identical SQL queries (Section 10)</w:t>
+      </w:r>
+    </w:p>
+    <w:p>
+      <w:pPr>
+        <w:pStyle w:val="ListParagraph"/>
+        <w:numPr>
+          <w:ilvl w:val="0"/>
+          <w:numId w:val="2"/>
+        </w:numPr>
+        <w:spacing w:after="60"/>
+      </w:pPr>
+      <w:r>
+        <w:rPr>
+          <w:rFonts w:ascii="Arial" w:cs="Arial" w:eastAsia="Arial" w:hAnsi="Arial"/>
+          <w:sz w:val="20"/>
+          <w:szCs w:val="20"/>
+        </w:rPr>
+        <w:t xml:space="preserve">Integrate saved prompts into notification preference matrix — prompts appear alongside saved filters in the per-filter override dropdown</w:t>
+      </w:r>
+    </w:p>
+    <w:p>
+      <w:pPr>
+        <w:pStyle w:val="ListParagraph"/>
+        <w:numPr>
+          <w:ilvl w:val="0"/>
+          <w:numId w:val="2"/>
+        </w:numPr>
+        <w:spacing w:after="60"/>
+      </w:pPr>
+      <w:r>
+        <w:rPr>
+          <w:rFonts w:ascii="Arial" w:cs="Arial" w:eastAsia="Arial" w:hAnsi="Arial"/>
+          <w:sz w:val="20"/>
+          <w:szCs w:val="20"/>
+        </w:rPr>
+        <w:t xml:space="preserve">Integrate saved prompts into auto-apply system — prompts can be assigned to resume levels just like filters. When a new job matches a prompt’s derived_filters, the same auto-apply flow triggers.</w:t>
+      </w:r>
+    </w:p>
+    <w:p>
+      <w:pPr>
+        <w:pStyle w:val="ListParagraph"/>
+        <w:numPr>
+          <w:ilvl w:val="0"/>
+          <w:numId w:val="2"/>
+        </w:numPr>
+        <w:spacing w:after="60"/>
+      </w:pPr>
+      <w:r>
+        <w:rPr>
+          <w:rFonts w:ascii="Arial" w:cs="Arial" w:eastAsia="Arial" w:hAnsi="Arial"/>
+          <w:sz w:val="20"/>
+          <w:szCs w:val="20"/>
+        </w:rPr>
+        <w:t xml:space="preserve">Integrate saved prompts into per-job Match % calculation — when a prompt is the active search, match scores use derived_filters pills for comparison</w:t>
+      </w:r>
+    </w:p>
+    <w:p>
+      <w:pPr>
+        <w:pStyle w:val="ListParagraph"/>
+        <w:numPr>
+          <w:ilvl w:val="0"/>
+          <w:numId w:val="2"/>
+        </w:numPr>
+        <w:spacing w:after="120"/>
+      </w:pPr>
+      <w:r>
+        <w:rPr>
+          <w:rFonts w:ascii="Arial" w:cs="Arial" w:eastAsia="Arial" w:hAnsi="Arial"/>
+          <w:sz w:val="20"/>
+          <w:szCs w:val="20"/>
+        </w:rPr>
+        <w:t xml:space="preserve">Test end-to-end: create chat prompt → save → assign to resume level → verify new matching job triggers notification → verify auto-apply fires → verify match % displays correctly</w:t>
+      </w:r>
+    </w:p>
+    <w:p>
+      <w:pPr>
+        <w:spacing w:after="80"/>
+      </w:pPr>
+      <w:r>
+        <w:rPr>
+          <w:rFonts w:ascii="Arial" w:cs="Arial" w:eastAsia="Arial" w:hAnsi="Arial"/>
+          <w:b/>
+          <w:bCs/>
+          <w:color w:val="1F2937"/>
+          <w:sz w:val="20"/>
+          <w:szCs w:val="20"/>
+        </w:rPr>
+        <w:t xml:space="preserve">Session 5 exit criteria: </w:t>
+      </w:r>
+      <w:r>
+        <w:rPr>
+          <w:rFonts w:ascii="Arial" w:cs="Arial" w:eastAsia="Arial" w:hAnsi="Arial"/>
+          <w:color w:val="374151"/>
+          <w:sz w:val="20"/>
+          <w:szCs w:val="20"/>
+        </w:rPr>
+        <w:t xml:space="preserve">Saved prompts are fully interchangeable with saved filters across matching, notifications, and auto-apply. No downstream system can distinguish between a filter-origin and prompt-origin search.</w:t>
+      </w:r>
+    </w:p>
+    <w:p>
+      <w:pPr>
+        <w:spacing w:after="80"/>
+      </w:pPr>
+    </w:p>
+    <w:tbl>
+      <w:tblPr>
+        <w:tblW w:type="dxa" w:w="9840"/>
+        <w:tblBorders>
+          <w:top w:val="single" w:color="auto" w:sz="4"/>
+          <w:left w:val="single" w:color="auto" w:sz="4"/>
+          <w:bottom w:val="single" w:color="auto" w:sz="4"/>
+          <w:right w:val="single" w:color="auto" w:sz="4"/>
+          <w:insideH w:val="single" w:color="auto" w:sz="4"/>
+          <w:insideV w:val="single" w:color="auto" w:sz="4"/>
+        </w:tblBorders>
+      </w:tblPr>
+      <w:tblGrid>
+        <w:gridCol w:w="9840"/>
+      </w:tblGrid>
+      <w:tr>
+        <w:tc>
+          <w:tcPr>
+            <w:tcW w:type="dxa" w:w="9840"/>
+            <w:tcBorders>
+              <w:top w:val="single" w:color="2563EB" w:sz="8"/>
+              <w:left w:val="single" w:color="D1D5DB" w:sz="1"/>
+              <w:bottom w:val="single" w:color="D1D5DB" w:sz="1"/>
+              <w:right w:val="single" w:color="D1D5DB" w:sz="1"/>
+            </w:tcBorders>
+            <w:shd w:fill="DBEAFE" w:val="clear"/>
+            <w:tcMar>
+              <w:top w:type="dxa" w:w="120"/>
+              <w:left w:type="dxa" w:w="200"/>
+              <w:bottom w:type="dxa" w:w="120"/>
+              <w:right w:type="dxa" w:w="200"/>
+            </w:tcMar>
+          </w:tcPr>
+          <w:p>
+            <w:pPr>
+              <w:spacing w:after="40"/>
+            </w:pPr>
+            <w:r>
+              <w:rPr>
+                <w:rFonts w:ascii="Arial" w:cs="Arial" w:eastAsia="Arial" w:hAnsi="Arial"/>
+                <w:b/>
+                <w:bCs/>
+                <w:color w:val="1E40AF"/>
+                <w:sz w:val="24"/>
+                <w:szCs w:val="24"/>
+              </w:rPr>
+              <w:t xml:space="preserve">SESSION 6: PostHog Events + Polish + Version Release</w:t>
+            </w:r>
+          </w:p>
+          <w:p>
+            <w:r>
+              <w:rPr>
+                <w:rFonts w:ascii="Arial" w:cs="Arial" w:eastAsia="Arial" w:hAnsi="Arial"/>
+                <w:color w:val="6B7280"/>
+                <w:sz w:val="18"/>
+                <w:szCs w:val="18"/>
+              </w:rPr>
+              <w:t xml:space="preserve">Depends on: Session 5 (all systems integrated)</w:t>
+            </w:r>
+          </w:p>
+        </w:tc>
+      </w:tr>
+    </w:tbl>
+    <w:p>
+      <w:pPr>
+        <w:spacing w:after="80"/>
+      </w:pPr>
+    </w:p>
+    <w:p>
+      <w:pPr>
+        <w:pStyle w:val="ListParagraph"/>
+        <w:numPr>
+          <w:ilvl w:val="0"/>
+          <w:numId w:val="2"/>
+        </w:numPr>
+        <w:spacing w:after="60"/>
+      </w:pPr>
+      <w:r>
+        <w:rPr>
+          <w:rFonts w:ascii="Arial" w:cs="Arial" w:eastAsia="Arial" w:hAnsi="Arial"/>
+          <w:sz w:val="20"/>
+          <w:szCs w:val="20"/>
+        </w:rPr>
+        <w:t xml:space="preserve">Instrument all 11 PostHog events (Section 12) — search_mode_toggled, chat_message_sent, chat_filter_extracted, chat_prompt_auto_generated, chat_prompt_modified, chat_prompt_scrapped, chat_to_filter_sync, chat_prompt_saved, chat_prompt_loaded, chat_rate_limited, chat_off_topic_blocked</w:t>
+      </w:r>
+    </w:p>
+    <w:p>
+      <w:pPr>
+        <w:pStyle w:val="ListParagraph"/>
+        <w:numPr>
+          <w:ilvl w:val="0"/>
+          <w:numId w:val="2"/>
+        </w:numPr>
+        <w:spacing w:after="60"/>
+      </w:pPr>
+      <w:r>
+        <w:rPr>
+          <w:rFonts w:ascii="Arial" w:cs="Arial" w:eastAsia="Arial" w:hAnsi="Arial"/>
+          <w:sz w:val="20"/>
+          <w:szCs w:val="20"/>
+        </w:rPr>
+        <w:t xml:space="preserve">Injection hardening review — test all 3 layers with adversarial inputs: prompt reveal attempts, persona changes, instruction overrides, SQL injection in filter values, XSS in chat messages</w:t>
+      </w:r>
+    </w:p>
+    <w:p>
+      <w:pPr>
+        <w:pStyle w:val="ListParagraph"/>
+        <w:numPr>
+          <w:ilvl w:val="0"/>
+          <w:numId w:val="2"/>
+        </w:numPr>
+        <w:spacing w:after="60"/>
+      </w:pPr>
+      <w:r>
+        <w:rPr>
+          <w:rFonts w:ascii="Arial" w:cs="Arial" w:eastAsia="Arial" w:hAnsi="Arial"/>
+          <w:sz w:val="20"/>
+          <w:szCs w:val="20"/>
+        </w:rPr>
+        <w:t xml:space="preserve">UI polish pass — loading states (skeleton in conversation area while Haiku responds), error states (Edge Function timeout, API failure), empty states (no conversation yet), animations and transitions</w:t>
+      </w:r>
+    </w:p>
+    <w:p>
+      <w:pPr>
+        <w:pStyle w:val="ListParagraph"/>
+        <w:numPr>
+          <w:ilvl w:val="0"/>
+          <w:numId w:val="2"/>
+        </w:numPr>
+        <w:spacing w:after="60"/>
+      </w:pPr>
+      <w:r>
+        <w:rPr>
+          <w:rFonts w:ascii="Arial" w:cs="Arial" w:eastAsia="Arial" w:hAnsi="Arial"/>
+          <w:sz w:val="20"/>
+          <w:szCs w:val="20"/>
+        </w:rPr>
+        <w:t xml:space="preserve">pg_cron job: chat_usage cleanup — delete records older than 48h, scheduled every 6 hours</w:t>
+      </w:r>
+    </w:p>
+    <w:p>
+      <w:pPr>
+        <w:pStyle w:val="ListParagraph"/>
+        <w:numPr>
+          <w:ilvl w:val="0"/>
+          <w:numId w:val="2"/>
+        </w:numPr>
+        <w:spacing w:after="60"/>
+      </w:pPr>
+      <w:r>
+        <w:rPr>
+          <w:rFonts w:ascii="Arial" w:cs="Arial" w:eastAsia="Arial" w:hAnsi="Arial"/>
+          <w:sz w:val="20"/>
+          <w:szCs w:val="20"/>
+        </w:rPr>
+        <w:t xml:space="preserve">Run full acceptance criteria checklist (Section 13) — all 20 items must pass</w:t>
+      </w:r>
+    </w:p>
+    <w:p>
+      <w:pPr>
+        <w:pStyle w:val="ListParagraph"/>
+        <w:numPr>
+          <w:ilvl w:val="0"/>
+          <w:numId w:val="2"/>
+        </w:numPr>
+        <w:spacing w:after="60"/>
+      </w:pPr>
+      <w:r>
+        <w:rPr>
+          <w:rFonts w:ascii="Arial" w:cs="Arial" w:eastAsia="Arial" w:hAnsi="Arial"/>
+          <w:sz w:val="20"/>
+          <w:szCs w:val="20"/>
+        </w:rPr>
+        <w:t xml:space="preserve">Version release per VERSION_METHODOLOGY.docx — update js/version.js, dashboard.html, index.html, CHANGELOG.md, create git tag</w:t>
+      </w:r>
+    </w:p>
+    <w:p>
+      <w:pPr>
+        <w:pStyle w:val="ListParagraph"/>
+        <w:numPr>
+          <w:ilvl w:val="0"/>
+          <w:numId w:val="2"/>
+        </w:numPr>
+        <w:spacing w:after="120"/>
+      </w:pPr>
+      <w:r>
+        <w:rPr>
+          <w:rFonts w:ascii="Arial" w:cs="Arial" w:eastAsia="Arial" w:hAnsi="Arial"/>
+          <w:sz w:val="20"/>
+          <w:szCs w:val="20"/>
+        </w:rPr>
+        <w:t xml:space="preserve">Merge dev → staging → main. Trigger Vercel deploy.</w:t>
+      </w:r>
+    </w:p>
+    <w:p>
+      <w:pPr>
+        <w:spacing w:after="80"/>
+      </w:pPr>
+      <w:r>
+        <w:rPr>
+          <w:rFonts w:ascii="Arial" w:cs="Arial" w:eastAsia="Arial" w:hAnsi="Arial"/>
+          <w:b/>
+          <w:bCs/>
+          <w:color w:val="1F2937"/>
+          <w:sz w:val="20"/>
+          <w:szCs w:val="20"/>
+        </w:rPr>
+        <w:t xml:space="preserve">Session 6 exit criteria: </w:t>
+      </w:r>
+      <w:r>
+        <w:rPr>
+          <w:rFonts w:ascii="Arial" w:cs="Arial" w:eastAsia="Arial" w:hAnsi="Arial"/>
+          <w:color w:val="374151"/>
+          <w:sz w:val="20"/>
+          <w:szCs w:val="20"/>
+        </w:rPr>
+        <w:t xml:space="preserve">All 11 PostHog events fire. Injection protection passes adversarial testing. All 20 acceptance criteria pass. Version bumped, tagged, and deployed to production.</w:t>
+      </w:r>
+    </w:p>
+    <w:p>
+      <w:pPr>
+        <w:spacing w:after="80"/>
+      </w:pPr>
+    </w:p>
+    <w:p>
+      <w:pPr>
+        <w:pStyle w:val="Heading2"/>
+        <w:spacing w:after="160" w:before="280"/>
+      </w:pPr>
+      <w:r>
+        <w:rPr>
+          <w:rFonts w:ascii="Arial" w:cs="Arial" w:eastAsia="Arial" w:hAnsi="Arial"/>
+          <w:b/>
+          <w:bCs/>
+          <w:color w:val="2563EB"/>
+          <w:sz w:val="26"/>
+          <w:szCs w:val="26"/>
+        </w:rPr>
+        <w:t xml:space="preserve">Session Dependency Map</w:t>
+      </w:r>
+    </w:p>
+    <w:tbl>
+      <w:tblPr>
+        <w:tblW w:type="dxa" w:w="9840"/>
+        <w:tblBorders>
+          <w:top w:val="single" w:color="auto" w:sz="4"/>
+          <w:left w:val="single" w:color="auto" w:sz="4"/>
+          <w:bottom w:val="single" w:color="auto" w:sz="4"/>
+          <w:right w:val="single" w:color="auto" w:sz="4"/>
+          <w:insideH w:val="single" w:color="auto" w:sz="4"/>
+          <w:insideV w:val="single" w:color="auto" w:sz="4"/>
+        </w:tblBorders>
+      </w:tblPr>
+      <w:tblGrid>
+        <w:gridCol w:w="1600"/>
+        <w:gridCol w:w="4200"/>
+        <w:gridCol w:w="4040"/>
+      </w:tblGrid>
+      <w:tr>
+        <w:tc>
+          <w:tcPr>
+            <w:tcW w:type="dxa" w:w="1600"/>
+            <w:tcBorders>
+              <w:top w:val="single" w:color="D1D5DB" w:sz="1"/>
+              <w:left w:val="single" w:color="D1D5DB" w:sz="1"/>
+              <w:bottom w:val="single" w:color="D1D5DB" w:sz="1"/>
+              <w:right w:val="single" w:color="D1D5DB" w:sz="1"/>
+            </w:tcBorders>
+            <w:shd w:fill="1E40AF" w:val="clear"/>
+            <w:tcMar>
+              <w:top w:type="dxa" w:w="60"/>
+              <w:left w:type="dxa" w:w="100"/>
+              <w:bottom w:type="dxa" w:w="60"/>
+              <w:right w:type="dxa" w:w="100"/>
+            </w:tcMar>
+            <w:vAlign w:val="center"/>
+          </w:tcPr>
+          <w:p>
+            <w:r>
+              <w:rPr>
+                <w:rFonts w:ascii="Arial" w:cs="Arial" w:eastAsia="Arial" w:hAnsi="Arial"/>
+                <w:b/>
+                <w:bCs/>
+                <w:color w:val="FFFFFF"/>
+                <w:sz w:val="18"/>
+                <w:szCs w:val="18"/>
+              </w:rPr>
+              <w:t xml:space="preserve">Session</w:t>
+            </w:r>
+          </w:p>
+        </w:tc>
+        <w:tc>
+          <w:tcPr>
+            <w:tcW w:type="dxa" w:w="4200"/>
+            <w:tcBorders>
+              <w:top w:val="single" w:color="D1D5DB" w:sz="1"/>
+              <w:left w:val="single" w:color="D1D5DB" w:sz="1"/>
+              <w:bottom w:val="single" w:color="D1D5DB" w:sz="1"/>
+              <w:right w:val="single" w:color="D1D5DB" w:sz="1"/>
+            </w:tcBorders>
+            <w:shd w:fill="1E40AF" w:val="clear"/>
+            <w:tcMar>
+              <w:top w:type="dxa" w:w="60"/>
+              <w:left w:type="dxa" w:w="100"/>
+              <w:bottom w:type="dxa" w:w="60"/>
+              <w:right w:type="dxa" w:w="100"/>
+            </w:tcMar>
+            <w:vAlign w:val="center"/>
+          </w:tcPr>
+          <w:p>
+            <w:r>
+              <w:rPr>
+                <w:rFonts w:ascii="Arial" w:cs="Arial" w:eastAsia="Arial" w:hAnsi="Arial"/>
+                <w:b/>
+                <w:bCs/>
+                <w:color w:val="FFFFFF"/>
+                <w:sz w:val="18"/>
+                <w:szCs w:val="18"/>
+              </w:rPr>
+              <w:t xml:space="preserve">Builds</w:t>
+            </w:r>
+          </w:p>
+        </w:tc>
+        <w:tc>
+          <w:tcPr>
+            <w:tcW w:type="dxa" w:w="4040"/>
+            <w:tcBorders>
+              <w:top w:val="single" w:color="D1D5DB" w:sz="1"/>
+              <w:left w:val="single" w:color="D1D5DB" w:sz="1"/>
+              <w:bottom w:val="single" w:color="D1D5DB" w:sz="1"/>
+              <w:right w:val="single" w:color="D1D5DB" w:sz="1"/>
+            </w:tcBorders>
+            <w:shd w:fill="1E40AF" w:val="clear"/>
+            <w:tcMar>
+              <w:top w:type="dxa" w:w="60"/>
+              <w:left w:type="dxa" w:w="100"/>
+              <w:bottom w:type="dxa" w:w="60"/>
+              <w:right w:type="dxa" w:w="100"/>
+            </w:tcMar>
+            <w:vAlign w:val="center"/>
+          </w:tcPr>
+          <w:p>
+            <w:r>
+              <w:rPr>
+                <w:rFonts w:ascii="Arial" w:cs="Arial" w:eastAsia="Arial" w:hAnsi="Arial"/>
+                <w:b/>
+                <w:bCs/>
+                <w:color w:val="FFFFFF"/>
+                <w:sz w:val="18"/>
+                <w:szCs w:val="18"/>
+              </w:rPr>
+              <w:t xml:space="preserve">Unblocks</w:t>
+            </w:r>
+          </w:p>
+        </w:tc>
+      </w:tr>
+      <w:tr>
+        <w:tc>
+          <w:tcPr>
+            <w:tcW w:type="dxa" w:w="1600"/>
+            <w:tcBorders>
+              <w:top w:val="single" w:color="D1D5DB" w:sz="1"/>
+              <w:left w:val="single" w:color="D1D5DB" w:sz="1"/>
+              <w:bottom w:val="single" w:color="D1D5DB" w:sz="1"/>
+              <w:right w:val="single" w:color="D1D5DB" w:sz="1"/>
+            </w:tcBorders>
+            <w:tcMar>
+              <w:top w:type="dxa" w:w="60"/>
+              <w:left w:type="dxa" w:w="100"/>
+              <w:bottom w:type="dxa" w:w="60"/>
+              <w:right w:type="dxa" w:w="100"/>
+            </w:tcMar>
+          </w:tcPr>
+          <w:p>
+            <w:r>
+              <w:rPr>
+                <w:rFonts w:ascii="Arial" w:cs="Arial" w:eastAsia="Arial" w:hAnsi="Arial"/>
+                <w:b/>
+                <w:bCs/>
+                <w:sz w:val="18"/>
+                <w:szCs w:val="18"/>
+              </w:rPr>
+              <w:t xml:space="preserve">1</w:t>
+            </w:r>
+          </w:p>
+        </w:tc>
+        <w:tc>
+          <w:tcPr>
+            <w:tcW w:type="dxa" w:w="4200"/>
+            <w:tcBorders>
+              <w:top w:val="single" w:color="D1D5DB" w:sz="1"/>
+              <w:left w:val="single" w:color="D1D5DB" w:sz="1"/>
+              <w:bottom w:val="single" w:color="D1D5DB" w:sz="1"/>
+              <w:right w:val="single" w:color="D1D5DB" w:sz="1"/>
+            </w:tcBorders>
+            <w:tcMar>
+              <w:top w:type="dxa" w:w="60"/>
+              <w:left w:type="dxa" w:w="100"/>
+              <w:bottom w:type="dxa" w:w="60"/>
+              <w:right w:type="dxa" w:w="100"/>
+            </w:tcMar>
+          </w:tcPr>
+          <w:p>
+            <w:r>
+              <w:rPr>
+                <w:rFonts w:ascii="Arial" w:cs="Arial" w:eastAsia="Arial" w:hAnsi="Arial"/>
+                <w:sz w:val="18"/>
+                <w:szCs w:val="18"/>
+              </w:rPr>
+              <w:t xml:space="preserve">Schema + 3 Edge Functions</w:t>
+            </w:r>
+          </w:p>
+        </w:tc>
+        <w:tc>
+          <w:tcPr>
+            <w:tcW w:type="dxa" w:w="4040"/>
+            <w:tcBorders>
+              <w:top w:val="single" w:color="D1D5DB" w:sz="1"/>
+              <w:left w:val="single" w:color="D1D5DB" w:sz="1"/>
+              <w:bottom w:val="single" w:color="D1D5DB" w:sz="1"/>
+              <w:right w:val="single" w:color="D1D5DB" w:sz="1"/>
+            </w:tcBorders>
+            <w:tcMar>
+              <w:top w:type="dxa" w:w="60"/>
+              <w:left w:type="dxa" w:w="100"/>
+              <w:bottom w:type="dxa" w:w="60"/>
+              <w:right w:type="dxa" w:w="100"/>
+            </w:tcMar>
+          </w:tcPr>
+          <w:p>
+            <w:r>
+              <w:rPr>
+                <w:rFonts w:ascii="Arial" w:cs="Arial" w:eastAsia="Arial" w:hAnsi="Arial"/>
+                <w:sz w:val="18"/>
+                <w:szCs w:val="18"/>
+              </w:rPr>
+              <w:t xml:space="preserve">Everything — all sessions depend on this</w:t>
+            </w:r>
+          </w:p>
+        </w:tc>
+      </w:tr>
+      <w:tr>
+        <w:tc>
+          <w:tcPr>
+            <w:tcW w:type="dxa" w:w="1600"/>
+            <w:tcBorders>
+              <w:top w:val="single" w:color="D1D5DB" w:sz="1"/>
+              <w:left w:val="single" w:color="D1D5DB" w:sz="1"/>
+              <w:bottom w:val="single" w:color="D1D5DB" w:sz="1"/>
+              <w:right w:val="single" w:color="D1D5DB" w:sz="1"/>
+            </w:tcBorders>
+            <w:tcMar>
+              <w:top w:type="dxa" w:w="60"/>
+              <w:left w:type="dxa" w:w="100"/>
+              <w:bottom w:type="dxa" w:w="60"/>
+              <w:right w:type="dxa" w:w="100"/>
+            </w:tcMar>
+          </w:tcPr>
+          <w:p>
+            <w:r>
+              <w:rPr>
+                <w:rFonts w:ascii="Arial" w:cs="Arial" w:eastAsia="Arial" w:hAnsi="Arial"/>
+                <w:b/>
+                <w:bCs/>
+                <w:sz w:val="18"/>
+                <w:szCs w:val="18"/>
+              </w:rPr>
+              <w:t xml:space="preserve">2</w:t>
+            </w:r>
+          </w:p>
+        </w:tc>
+        <w:tc>
+          <w:tcPr>
+            <w:tcW w:type="dxa" w:w="4200"/>
+            <w:tcBorders>
+              <w:top w:val="single" w:color="D1D5DB" w:sz="1"/>
+              <w:left w:val="single" w:color="D1D5DB" w:sz="1"/>
+              <w:bottom w:val="single" w:color="D1D5DB" w:sz="1"/>
+              <w:right w:val="single" w:color="D1D5DB" w:sz="1"/>
+            </w:tcBorders>
+            <w:tcMar>
+              <w:top w:type="dxa" w:w="60"/>
+              <w:left w:type="dxa" w:w="100"/>
+              <w:bottom w:type="dxa" w:w="60"/>
+              <w:right w:type="dxa" w:w="100"/>
+            </w:tcMar>
+          </w:tcPr>
+          <w:p>
+            <w:r>
+              <w:rPr>
+                <w:rFonts w:ascii="Arial" w:cs="Arial" w:eastAsia="Arial" w:hAnsi="Arial"/>
+                <w:sz w:val="18"/>
+                <w:szCs w:val="18"/>
+              </w:rPr>
+              <w:t xml:space="preserve">Toggle UI + Chat Panel + Feed Wiring</w:t>
+            </w:r>
+          </w:p>
+        </w:tc>
+        <w:tc>
+          <w:tcPr>
+            <w:tcW w:type="dxa" w:w="4040"/>
+            <w:tcBorders>
+              <w:top w:val="single" w:color="D1D5DB" w:sz="1"/>
+              <w:left w:val="single" w:color="D1D5DB" w:sz="1"/>
+              <w:bottom w:val="single" w:color="D1D5DB" w:sz="1"/>
+              <w:right w:val="single" w:color="D1D5DB" w:sz="1"/>
+            </w:tcBorders>
+            <w:tcMar>
+              <w:top w:type="dxa" w:w="60"/>
+              <w:left w:type="dxa" w:w="100"/>
+              <w:bottom w:type="dxa" w:w="60"/>
+              <w:right w:type="dxa" w:w="100"/>
+            </w:tcMar>
+          </w:tcPr>
+          <w:p>
+            <w:r>
+              <w:rPr>
+                <w:rFonts w:ascii="Arial" w:cs="Arial" w:eastAsia="Arial" w:hAnsi="Arial"/>
+                <w:sz w:val="18"/>
+                <w:szCs w:val="18"/>
+              </w:rPr>
+              <w:t xml:space="preserve">Sessions 3, 4, 5, 6</w:t>
+            </w:r>
+          </w:p>
+        </w:tc>
+      </w:tr>
+      <w:tr>
+        <w:tc>
+          <w:tcPr>
+            <w:tcW w:type="dxa" w:w="1600"/>
+            <w:tcBorders>
+              <w:top w:val="single" w:color="D1D5DB" w:sz="1"/>
+              <w:left w:val="single" w:color="D1D5DB" w:sz="1"/>
+              <w:bottom w:val="single" w:color="D1D5DB" w:sz="1"/>
+              <w:right w:val="single" w:color="D1D5DB" w:sz="1"/>
+            </w:tcBorders>
+            <w:tcMar>
+              <w:top w:type="dxa" w:w="60"/>
+              <w:left w:type="dxa" w:w="100"/>
+              <w:bottom w:type="dxa" w:w="60"/>
+              <w:right w:type="dxa" w:w="100"/>
+            </w:tcMar>
+          </w:tcPr>
+          <w:p>
+            <w:r>
+              <w:rPr>
+                <w:rFonts w:ascii="Arial" w:cs="Arial" w:eastAsia="Arial" w:hAnsi="Arial"/>
+                <w:b/>
+                <w:bCs/>
+                <w:sz w:val="18"/>
+                <w:szCs w:val="18"/>
+              </w:rPr>
+              <w:t xml:space="preserve">3</w:t>
+            </w:r>
+          </w:p>
+        </w:tc>
+        <w:tc>
+          <w:tcPr>
+            <w:tcW w:type="dxa" w:w="4200"/>
+            <w:tcBorders>
+              <w:top w:val="single" w:color="D1D5DB" w:sz="1"/>
+              <w:left w:val="single" w:color="D1D5DB" w:sz="1"/>
+              <w:bottom w:val="single" w:color="D1D5DB" w:sz="1"/>
+              <w:right w:val="single" w:color="D1D5DB" w:sz="1"/>
+            </w:tcBorders>
+            <w:tcMar>
+              <w:top w:type="dxa" w:w="60"/>
+              <w:left w:type="dxa" w:w="100"/>
+              <w:bottom w:type="dxa" w:w="60"/>
+              <w:right w:type="dxa" w:w="100"/>
+            </w:tcMar>
+          </w:tcPr>
+          <w:p>
+            <w:r>
+              <w:rPr>
+                <w:rFonts w:ascii="Arial" w:cs="Arial" w:eastAsia="Arial" w:hAnsi="Arial"/>
+                <w:sz w:val="18"/>
+                <w:szCs w:val="18"/>
+              </w:rPr>
+              <w:t xml:space="preserve">Filter↔Chat bidirectional sync</w:t>
+            </w:r>
+          </w:p>
+        </w:tc>
+        <w:tc>
+          <w:tcPr>
+            <w:tcW w:type="dxa" w:w="4040"/>
+            <w:tcBorders>
+              <w:top w:val="single" w:color="D1D5DB" w:sz="1"/>
+              <w:left w:val="single" w:color="D1D5DB" w:sz="1"/>
+              <w:bottom w:val="single" w:color="D1D5DB" w:sz="1"/>
+              <w:right w:val="single" w:color="D1D5DB" w:sz="1"/>
+            </w:tcBorders>
+            <w:tcMar>
+              <w:top w:type="dxa" w:w="60"/>
+              <w:left w:type="dxa" w:w="100"/>
+              <w:bottom w:type="dxa" w:w="60"/>
+              <w:right w:type="dxa" w:w="100"/>
+            </w:tcMar>
+          </w:tcPr>
+          <w:p>
+            <w:r>
+              <w:rPr>
+                <w:rFonts w:ascii="Arial" w:cs="Arial" w:eastAsia="Arial" w:hAnsi="Arial"/>
+                <w:sz w:val="18"/>
+                <w:szCs w:val="18"/>
+              </w:rPr>
+              <w:t xml:space="preserve">Sessions 4, 5</w:t>
+            </w:r>
+          </w:p>
+        </w:tc>
+      </w:tr>
+      <w:tr>
+        <w:tc>
+          <w:tcPr>
+            <w:tcW w:type="dxa" w:w="1600"/>
+            <w:tcBorders>
+              <w:top w:val="single" w:color="D1D5DB" w:sz="1"/>
+              <w:left w:val="single" w:color="D1D5DB" w:sz="1"/>
+              <w:bottom w:val="single" w:color="D1D5DB" w:sz="1"/>
+              <w:right w:val="single" w:color="D1D5DB" w:sz="1"/>
+            </w:tcBorders>
+            <w:tcMar>
+              <w:top w:type="dxa" w:w="60"/>
+              <w:left w:type="dxa" w:w="100"/>
+              <w:bottom w:type="dxa" w:w="60"/>
+              <w:right w:type="dxa" w:w="100"/>
+            </w:tcMar>
+          </w:tcPr>
+          <w:p>
+            <w:r>
+              <w:rPr>
+                <w:rFonts w:ascii="Arial" w:cs="Arial" w:eastAsia="Arial" w:hAnsi="Arial"/>
+                <w:b/>
+                <w:bCs/>
+                <w:sz w:val="18"/>
+                <w:szCs w:val="18"/>
+              </w:rPr>
+              <w:t xml:space="preserve">4</w:t>
+            </w:r>
+          </w:p>
+        </w:tc>
+        <w:tc>
+          <w:tcPr>
+            <w:tcW w:type="dxa" w:w="4200"/>
+            <w:tcBorders>
+              <w:top w:val="single" w:color="D1D5DB" w:sz="1"/>
+              <w:left w:val="single" w:color="D1D5DB" w:sz="1"/>
+              <w:bottom w:val="single" w:color="D1D5DB" w:sz="1"/>
+              <w:right w:val="single" w:color="D1D5DB" w:sz="1"/>
+            </w:tcBorders>
+            <w:tcMar>
+              <w:top w:type="dxa" w:w="60"/>
+              <w:left w:type="dxa" w:w="100"/>
+              <w:bottom w:type="dxa" w:w="60"/>
+              <w:right w:type="dxa" w:w="100"/>
+            </w:tcMar>
+          </w:tcPr>
+          <w:p>
+            <w:r>
+              <w:rPr>
+                <w:rFonts w:ascii="Arial" w:cs="Arial" w:eastAsia="Arial" w:hAnsi="Arial"/>
+                <w:sz w:val="18"/>
+                <w:szCs w:val="18"/>
+              </w:rPr>
+              <w:t xml:space="preserve">Saved prompts + persistence + selector</w:t>
+            </w:r>
+          </w:p>
+        </w:tc>
+        <w:tc>
+          <w:tcPr>
+            <w:tcW w:type="dxa" w:w="4040"/>
+            <w:tcBorders>
+              <w:top w:val="single" w:color="D1D5DB" w:sz="1"/>
+              <w:left w:val="single" w:color="D1D5DB" w:sz="1"/>
+              <w:bottom w:val="single" w:color="D1D5DB" w:sz="1"/>
+              <w:right w:val="single" w:color="D1D5DB" w:sz="1"/>
+            </w:tcBorders>
+            <w:tcMar>
+              <w:top w:type="dxa" w:w="60"/>
+              <w:left w:type="dxa" w:w="100"/>
+              <w:bottom w:type="dxa" w:w="60"/>
+              <w:right w:type="dxa" w:w="100"/>
+            </w:tcMar>
+          </w:tcPr>
+          <w:p>
+            <w:r>
+              <w:rPr>
+                <w:rFonts w:ascii="Arial" w:cs="Arial" w:eastAsia="Arial" w:hAnsi="Arial"/>
+                <w:sz w:val="18"/>
+                <w:szCs w:val="18"/>
+              </w:rPr>
+              <w:t xml:space="preserve">Session 5</w:t>
+            </w:r>
+          </w:p>
+        </w:tc>
+      </w:tr>
+      <w:tr>
+        <w:tc>
+          <w:tcPr>
+            <w:tcW w:type="dxa" w:w="1600"/>
+            <w:tcBorders>
+              <w:top w:val="single" w:color="D1D5DB" w:sz="1"/>
+              <w:left w:val="single" w:color="D1D5DB" w:sz="1"/>
+              <w:bottom w:val="single" w:color="D1D5DB" w:sz="1"/>
+              <w:right w:val="single" w:color="D1D5DB" w:sz="1"/>
+            </w:tcBorders>
+            <w:tcMar>
+              <w:top w:type="dxa" w:w="60"/>
+              <w:left w:type="dxa" w:w="100"/>
+              <w:bottom w:type="dxa" w:w="60"/>
+              <w:right w:type="dxa" w:w="100"/>
+            </w:tcMar>
+          </w:tcPr>
+          <w:p>
+            <w:r>
+              <w:rPr>
+                <w:rFonts w:ascii="Arial" w:cs="Arial" w:eastAsia="Arial" w:hAnsi="Arial"/>
+                <w:b/>
+                <w:bCs/>
+                <w:sz w:val="18"/>
+                <w:szCs w:val="18"/>
+              </w:rPr>
+              <w:t xml:space="preserve">5</w:t>
+            </w:r>
+          </w:p>
+        </w:tc>
+        <w:tc>
+          <w:tcPr>
+            <w:tcW w:type="dxa" w:w="4200"/>
+            <w:tcBorders>
+              <w:top w:val="single" w:color="D1D5DB" w:sz="1"/>
+              <w:left w:val="single" w:color="D1D5DB" w:sz="1"/>
+              <w:bottom w:val="single" w:color="D1D5DB" w:sz="1"/>
+              <w:right w:val="single" w:color="D1D5DB" w:sz="1"/>
+            </w:tcBorders>
+            <w:tcMar>
+              <w:top w:type="dxa" w:w="60"/>
+              <w:left w:type="dxa" w:w="100"/>
+              <w:bottom w:type="dxa" w:w="60"/>
+              <w:right w:type="dxa" w:w="100"/>
+            </w:tcMar>
+          </w:tcPr>
+          <w:p>
+            <w:r>
+              <w:rPr>
+                <w:rFonts w:ascii="Arial" w:cs="Arial" w:eastAsia="Arial" w:hAnsi="Arial"/>
+                <w:sz w:val="18"/>
+                <w:szCs w:val="18"/>
+              </w:rPr>
+              <w:t xml:space="preserve">Matching + notifications + auto-apply integration</w:t>
+            </w:r>
+          </w:p>
+        </w:tc>
+        <w:tc>
+          <w:tcPr>
+            <w:tcW w:type="dxa" w:w="4040"/>
+            <w:tcBorders>
+              <w:top w:val="single" w:color="D1D5DB" w:sz="1"/>
+              <w:left w:val="single" w:color="D1D5DB" w:sz="1"/>
+              <w:bottom w:val="single" w:color="D1D5DB" w:sz="1"/>
+              <w:right w:val="single" w:color="D1D5DB" w:sz="1"/>
+            </w:tcBorders>
+            <w:tcMar>
+              <w:top w:type="dxa" w:w="60"/>
+              <w:left w:type="dxa" w:w="100"/>
+              <w:bottom w:type="dxa" w:w="60"/>
+              <w:right w:type="dxa" w:w="100"/>
+            </w:tcMar>
+          </w:tcPr>
+          <w:p>
+            <w:r>
+              <w:rPr>
+                <w:rFonts w:ascii="Arial" w:cs="Arial" w:eastAsia="Arial" w:hAnsi="Arial"/>
+                <w:sz w:val="18"/>
+                <w:szCs w:val="18"/>
+              </w:rPr>
+              <w:t xml:space="preserve">Session 6</w:t>
+            </w:r>
+          </w:p>
+        </w:tc>
+      </w:tr>
+      <w:tr>
+        <w:tc>
+          <w:tcPr>
+            <w:tcW w:type="dxa" w:w="1600"/>
+            <w:tcBorders>
+              <w:top w:val="single" w:color="D1D5DB" w:sz="1"/>
+              <w:left w:val="single" w:color="D1D5DB" w:sz="1"/>
+              <w:bottom w:val="single" w:color="D1D5DB" w:sz="1"/>
+              <w:right w:val="single" w:color="D1D5DB" w:sz="1"/>
+            </w:tcBorders>
+            <w:tcMar>
+              <w:top w:type="dxa" w:w="60"/>
+              <w:left w:type="dxa" w:w="100"/>
+              <w:bottom w:type="dxa" w:w="60"/>
+              <w:right w:type="dxa" w:w="100"/>
+            </w:tcMar>
+          </w:tcPr>
+          <w:p>
+            <w:r>
+              <w:rPr>
+                <w:rFonts w:ascii="Arial" w:cs="Arial" w:eastAsia="Arial" w:hAnsi="Arial"/>
+                <w:b/>
+                <w:bCs/>
+                <w:sz w:val="18"/>
+                <w:szCs w:val="18"/>
+              </w:rPr>
+              <w:t xml:space="preserve">6</w:t>
+            </w:r>
+          </w:p>
+        </w:tc>
+        <w:tc>
+          <w:tcPr>
+            <w:tcW w:type="dxa" w:w="4200"/>
+            <w:tcBorders>
+              <w:top w:val="single" w:color="D1D5DB" w:sz="1"/>
+              <w:left w:val="single" w:color="D1D5DB" w:sz="1"/>
+              <w:bottom w:val="single" w:color="D1D5DB" w:sz="1"/>
+              <w:right w:val="single" w:color="D1D5DB" w:sz="1"/>
+            </w:tcBorders>
+            <w:tcMar>
+              <w:top w:type="dxa" w:w="60"/>
+              <w:left w:type="dxa" w:w="100"/>
+              <w:bottom w:type="dxa" w:w="60"/>
+              <w:right w:type="dxa" w:w="100"/>
+            </w:tcMar>
+          </w:tcPr>
+          <w:p>
+            <w:r>
+              <w:rPr>
+                <w:rFonts w:ascii="Arial" w:cs="Arial" w:eastAsia="Arial" w:hAnsi="Arial"/>
+                <w:sz w:val="18"/>
+                <w:szCs w:val="18"/>
+              </w:rPr>
+              <w:t xml:space="preserve">PostHog + security review + polish + release</w:t>
+            </w:r>
+          </w:p>
+        </w:tc>
+        <w:tc>
+          <w:tcPr>
+            <w:tcW w:type="dxa" w:w="4040"/>
+            <w:tcBorders>
+              <w:top w:val="single" w:color="D1D5DB" w:sz="1"/>
+              <w:left w:val="single" w:color="D1D5DB" w:sz="1"/>
+              <w:bottom w:val="single" w:color="D1D5DB" w:sz="1"/>
+              <w:right w:val="single" w:color="D1D5DB" w:sz="1"/>
+            </w:tcBorders>
+            <w:tcMar>
+              <w:top w:type="dxa" w:w="60"/>
+              <w:left w:type="dxa" w:w="100"/>
+              <w:bottom w:type="dxa" w:w="60"/>
+              <w:right w:type="dxa" w:w="100"/>
+            </w:tcMar>
+          </w:tcPr>
+          <w:p>
+            <w:r>
+              <w:rPr>
+                <w:rFonts w:ascii="Arial" w:cs="Arial" w:eastAsia="Arial" w:hAnsi="Arial"/>
+                <w:sz w:val="18"/>
+                <w:szCs w:val="18"/>
+              </w:rPr>
+              <w:t xml:space="preserve">Production deployment</w:t>
+            </w:r>
+          </w:p>
+        </w:tc>
+      </w:tr>
+    </w:tbl>
     <w:sectPr>
       <w:headerReference w:type="default" r:id="rId7"/>
       <w:footerReference w:type="default" r:id="rId8"/>

</xml_diff>